<commit_message>
fix(p3): label performing party Executor in five AOSR
</commit_message>
<xml_diff>
--- a/tools/candidates/p3-aosr-form-layout-20261015/03-akt-skrytyh-rabot.docx
+++ b/tools/candidates/p3-aosr-form-layout-20261015/03-akt-skrytyh-rabot.docx
@@ -561,7 +561,7 @@
                 <w:sz w:val="17"/>
                 <w:u w:val="none"/>
               </w:rPr>
-              <w:t>Лицо, осуществляющее строительство, реконструкцию, капитальный ремонт</w:t>
+              <w:t>Исполнитель (лицо, осуществляющее строительство, реконструкцию, капитальный ремонт)</w:t>
             </w:r>
           </w:p>
         </w:tc>
@@ -593,7 +593,7 @@
                 <w:sz w:val="18"/>
                 <w:u w:val="single"/>
               </w:rPr>
-              <w:t>{{A1_СТРОИТЕЛЬ}}</w:t>
+              <w:t>{{A1_ИСПОЛНИТЕЛЬ}}</w:t>
             </w:r>
           </w:p>
           <w:p>
@@ -860,7 +860,7 @@
                 <w:sz w:val="17"/>
                 <w:u w:val="none"/>
               </w:rPr>
-              <w:t>Представитель лица, осуществляющего строительство, реконструкцию, капитальный ремонт</w:t>
+              <w:t>Представитель Исполнителя (лица, осуществляющего строительство, реконструкцию, капитальный ремонт)</w:t>
             </w:r>
           </w:p>
         </w:tc>
@@ -892,7 +892,7 @@
                 <w:sz w:val="18"/>
                 <w:u w:val="single"/>
               </w:rPr>
-              <w:t>{{A1_ПРЕДСТАВИТЕЛЬ_СТРОИТЕЛЯ}}</w:t>
+              <w:t>{{A1_ПРЕДСТАВИТЕЛЬ_ИСПОЛНИТЕЛЯ}}</w:t>
             </w:r>
           </w:p>
           <w:p>
@@ -943,7 +943,7 @@
                 <w:sz w:val="17"/>
                 <w:u w:val="none"/>
               </w:rPr>
-              <w:t>Представитель лица, осуществляющего строительство, реконструкцию, капитальный ремонт, по вопросам строительного контроля</w:t>
+              <w:t>Представитель Исполнителя по вопросам строительного контроля (лица, осуществляющего строительство, реконструкцию, капитальный ремонт)</w:t>
             </w:r>
           </w:p>
         </w:tc>
@@ -975,7 +975,7 @@
                 <w:sz w:val="18"/>
                 <w:u w:val="single"/>
               </w:rPr>
-              <w:t>{{A1_СТРОЙКОНТРОЛЬ_СТРОИТЕЛЯ}}</w:t>
+              <w:t>{{A1_СТРОЙКОНТРОЛЬ_ИСПОЛНИТЕЛЯ}}</w:t>
             </w:r>
           </w:p>
           <w:p>
@@ -1141,7 +1141,7 @@
                 <w:sz w:val="18"/>
                 <w:u w:val="single"/>
               </w:rPr>
-              <w:t>{{A1_ПРЕДСТАВИТЕЛЬ_ИСПОЛНИТЕЛЯ}}</w:t>
+              <w:t>{{A1_ПРЕДСТАВИТЕЛЬ_ИСПОЛНИТЕЛЯ_РАБОТ}}</w:t>
             </w:r>
           </w:p>
           <w:p>
@@ -2197,7 +2197,7 @@
                 <w:sz w:val="17"/>
                 <w:u w:val="none"/>
               </w:rPr>
-              <w:t>Представитель лица, осуществляющего строительство, реконструкцию, капитальный ремонт</w:t>
+              <w:t>Представитель Исполнителя (лица, осуществляющего строительство, реконструкцию, капитальный ремонт)</w:t>
             </w:r>
           </w:p>
         </w:tc>
@@ -2274,7 +2274,7 @@
                 <w:sz w:val="17"/>
                 <w:u w:val="none"/>
               </w:rPr>
-              <w:t>Представитель лица, осуществляющего строительство, реконструкцию, капитальный ремонт, по вопросам строительного контроля</w:t>
+              <w:t>Представитель Исполнителя по вопросам строительного контроля (лица, осуществляющего строительство, реконструкцию, капитальный ремонт)</w:t>
             </w:r>
           </w:p>
         </w:tc>
@@ -2743,7 +2743,7 @@
                 <w:sz w:val="17"/>
                 <w:u w:val="none"/>
               </w:rPr>
-              <w:t>Лицо, осуществляющее строительство, реконструкцию, капитальный ремонт</w:t>
+              <w:t>Исполнитель (лицо, осуществляющее строительство, реконструкцию, капитальный ремонт)</w:t>
             </w:r>
           </w:p>
         </w:tc>
@@ -2775,7 +2775,7 @@
                 <w:sz w:val="18"/>
                 <w:u w:val="single"/>
               </w:rPr>
-              <w:t>{{A2_СТРОИТЕЛЬ}}</w:t>
+              <w:t>{{A2_ИСПОЛНИТЕЛЬ}}</w:t>
             </w:r>
           </w:p>
           <w:p>
@@ -3042,7 +3042,7 @@
                 <w:sz w:val="17"/>
                 <w:u w:val="none"/>
               </w:rPr>
-              <w:t>Представитель лица, осуществляющего строительство, реконструкцию, капитальный ремонт</w:t>
+              <w:t>Представитель Исполнителя (лица, осуществляющего строительство, реконструкцию, капитальный ремонт)</w:t>
             </w:r>
           </w:p>
         </w:tc>
@@ -3074,7 +3074,7 @@
                 <w:sz w:val="18"/>
                 <w:u w:val="single"/>
               </w:rPr>
-              <w:t>{{A2_ПРЕДСТАВИТЕЛЬ_СТРОИТЕЛЯ}}</w:t>
+              <w:t>{{A2_ПРЕДСТАВИТЕЛЬ_ИСПОЛНИТЕЛЯ}}</w:t>
             </w:r>
           </w:p>
           <w:p>
@@ -3125,7 +3125,7 @@
                 <w:sz w:val="17"/>
                 <w:u w:val="none"/>
               </w:rPr>
-              <w:t>Представитель лица, осуществляющего строительство, реконструкцию, капитальный ремонт, по вопросам строительного контроля</w:t>
+              <w:t>Представитель Исполнителя по вопросам строительного контроля (лица, осуществляющего строительство, реконструкцию, капитальный ремонт)</w:t>
             </w:r>
           </w:p>
         </w:tc>
@@ -3157,7 +3157,7 @@
                 <w:sz w:val="18"/>
                 <w:u w:val="single"/>
               </w:rPr>
-              <w:t>{{A2_СТРОЙКОНТРОЛЬ_СТРОИТЕЛЯ}}</w:t>
+              <w:t>{{A2_СТРОЙКОНТРОЛЬ_ИСПОЛНИТЕЛЯ}}</w:t>
             </w:r>
           </w:p>
           <w:p>
@@ -3323,7 +3323,7 @@
                 <w:sz w:val="18"/>
                 <w:u w:val="single"/>
               </w:rPr>
-              <w:t>{{A2_ПРЕДСТАВИТЕЛЬ_ИСПОЛНИТЕЛЯ}}</w:t>
+              <w:t>{{A2_ПРЕДСТАВИТЕЛЬ_ИСПОЛНИТЕЛЯ_РАБОТ}}</w:t>
             </w:r>
           </w:p>
           <w:p>
@@ -4379,7 +4379,7 @@
                 <w:sz w:val="17"/>
                 <w:u w:val="none"/>
               </w:rPr>
-              <w:t>Представитель лица, осуществляющего строительство, реконструкцию, капитальный ремонт</w:t>
+              <w:t>Представитель Исполнителя (лица, осуществляющего строительство, реконструкцию, капитальный ремонт)</w:t>
             </w:r>
           </w:p>
         </w:tc>
@@ -4456,7 +4456,7 @@
                 <w:sz w:val="17"/>
                 <w:u w:val="none"/>
               </w:rPr>
-              <w:t>Представитель лица, осуществляющего строительство, реконструкцию, капитальный ремонт, по вопросам строительного контроля</w:t>
+              <w:t>Представитель Исполнителя по вопросам строительного контроля (лица, осуществляющего строительство, реконструкцию, капитальный ремонт)</w:t>
             </w:r>
           </w:p>
         </w:tc>
@@ -4925,7 +4925,7 @@
                 <w:sz w:val="17"/>
                 <w:u w:val="none"/>
               </w:rPr>
-              <w:t>Лицо, осуществляющее строительство, реконструкцию, капитальный ремонт</w:t>
+              <w:t>Исполнитель (лицо, осуществляющее строительство, реконструкцию, капитальный ремонт)</w:t>
             </w:r>
           </w:p>
         </w:tc>
@@ -4957,7 +4957,7 @@
                 <w:sz w:val="18"/>
                 <w:u w:val="single"/>
               </w:rPr>
-              <w:t>{{A3_СТРОИТЕЛЬ}}</w:t>
+              <w:t>{{A3_ИСПОЛНИТЕЛЬ}}</w:t>
             </w:r>
           </w:p>
           <w:p>
@@ -5224,7 +5224,7 @@
                 <w:sz w:val="17"/>
                 <w:u w:val="none"/>
               </w:rPr>
-              <w:t>Представитель лица, осуществляющего строительство, реконструкцию, капитальный ремонт</w:t>
+              <w:t>Представитель Исполнителя (лица, осуществляющего строительство, реконструкцию, капитальный ремонт)</w:t>
             </w:r>
           </w:p>
         </w:tc>
@@ -5256,7 +5256,7 @@
                 <w:sz w:val="18"/>
                 <w:u w:val="single"/>
               </w:rPr>
-              <w:t>{{A3_ПРЕДСТАВИТЕЛЬ_СТРОИТЕЛЯ}}</w:t>
+              <w:t>{{A3_ПРЕДСТАВИТЕЛЬ_ИСПОЛНИТЕЛЯ}}</w:t>
             </w:r>
           </w:p>
           <w:p>
@@ -5307,7 +5307,7 @@
                 <w:sz w:val="17"/>
                 <w:u w:val="none"/>
               </w:rPr>
-              <w:t>Представитель лица, осуществляющего строительство, реконструкцию, капитальный ремонт, по вопросам строительного контроля</w:t>
+              <w:t>Представитель Исполнителя по вопросам строительного контроля (лица, осуществляющего строительство, реконструкцию, капитальный ремонт)</w:t>
             </w:r>
           </w:p>
         </w:tc>
@@ -5339,7 +5339,7 @@
                 <w:sz w:val="18"/>
                 <w:u w:val="single"/>
               </w:rPr>
-              <w:t>{{A3_СТРОЙКОНТРОЛЬ_СТРОИТЕЛЯ}}</w:t>
+              <w:t>{{A3_СТРОЙКОНТРОЛЬ_ИСПОЛНИТЕЛЯ}}</w:t>
             </w:r>
           </w:p>
           <w:p>
@@ -5505,7 +5505,7 @@
                 <w:sz w:val="18"/>
                 <w:u w:val="single"/>
               </w:rPr>
-              <w:t>{{A3_ПРЕДСТАВИТЕЛЬ_ИСПОЛНИТЕЛЯ}}</w:t>
+              <w:t>{{A3_ПРЕДСТАВИТЕЛЬ_ИСПОЛНИТЕЛЯ_РАБОТ}}</w:t>
             </w:r>
           </w:p>
           <w:p>
@@ -6561,7 +6561,7 @@
                 <w:sz w:val="17"/>
                 <w:u w:val="none"/>
               </w:rPr>
-              <w:t>Представитель лица, осуществляющего строительство, реконструкцию, капитальный ремонт</w:t>
+              <w:t>Представитель Исполнителя (лица, осуществляющего строительство, реконструкцию, капитальный ремонт)</w:t>
             </w:r>
           </w:p>
         </w:tc>
@@ -6638,7 +6638,7 @@
                 <w:sz w:val="17"/>
                 <w:u w:val="none"/>
               </w:rPr>
-              <w:t>Представитель лица, осуществляющего строительство, реконструкцию, капитальный ремонт, по вопросам строительного контроля</w:t>
+              <w:t>Представитель Исполнителя по вопросам строительного контроля (лица, осуществляющего строительство, реконструкцию, капитальный ремонт)</w:t>
             </w:r>
           </w:p>
         </w:tc>
@@ -7107,7 +7107,7 @@
                 <w:sz w:val="17"/>
                 <w:u w:val="none"/>
               </w:rPr>
-              <w:t>Лицо, осуществляющее строительство, реконструкцию, капитальный ремонт</w:t>
+              <w:t>Исполнитель (лицо, осуществляющее строительство, реконструкцию, капитальный ремонт)</w:t>
             </w:r>
           </w:p>
         </w:tc>
@@ -7139,7 +7139,7 @@
                 <w:sz w:val="18"/>
                 <w:u w:val="single"/>
               </w:rPr>
-              <w:t>{{A4_СТРОИТЕЛЬ}}</w:t>
+              <w:t>{{A4_ИСПОЛНИТЕЛЬ}}</w:t>
             </w:r>
           </w:p>
           <w:p>
@@ -7406,7 +7406,7 @@
                 <w:sz w:val="17"/>
                 <w:u w:val="none"/>
               </w:rPr>
-              <w:t>Представитель лица, осуществляющего строительство, реконструкцию, капитальный ремонт</w:t>
+              <w:t>Представитель Исполнителя (лица, осуществляющего строительство, реконструкцию, капитальный ремонт)</w:t>
             </w:r>
           </w:p>
         </w:tc>
@@ -7438,7 +7438,7 @@
                 <w:sz w:val="18"/>
                 <w:u w:val="single"/>
               </w:rPr>
-              <w:t>{{A4_ПРЕДСТАВИТЕЛЬ_СТРОИТЕЛЯ}}</w:t>
+              <w:t>{{A4_ПРЕДСТАВИТЕЛЬ_ИСПОЛНИТЕЛЯ}}</w:t>
             </w:r>
           </w:p>
           <w:p>
@@ -7489,7 +7489,7 @@
                 <w:sz w:val="17"/>
                 <w:u w:val="none"/>
               </w:rPr>
-              <w:t>Представитель лица, осуществляющего строительство, реконструкцию, капитальный ремонт, по вопросам строительного контроля</w:t>
+              <w:t>Представитель Исполнителя по вопросам строительного контроля (лица, осуществляющего строительство, реконструкцию, капитальный ремонт)</w:t>
             </w:r>
           </w:p>
         </w:tc>
@@ -7521,7 +7521,7 @@
                 <w:sz w:val="18"/>
                 <w:u w:val="single"/>
               </w:rPr>
-              <w:t>{{A4_СТРОЙКОНТРОЛЬ_СТРОИТЕЛЯ}}</w:t>
+              <w:t>{{A4_СТРОЙКОНТРОЛЬ_ИСПОЛНИТЕЛЯ}}</w:t>
             </w:r>
           </w:p>
           <w:p>
@@ -7687,7 +7687,7 @@
                 <w:sz w:val="18"/>
                 <w:u w:val="single"/>
               </w:rPr>
-              <w:t>{{A4_ПРЕДСТАВИТЕЛЬ_ИСПОЛНИТЕЛЯ}}</w:t>
+              <w:t>{{A4_ПРЕДСТАВИТЕЛЬ_ИСПОЛНИТЕЛЯ_РАБОТ}}</w:t>
             </w:r>
           </w:p>
           <w:p>
@@ -8743,7 +8743,7 @@
                 <w:sz w:val="17"/>
                 <w:u w:val="none"/>
               </w:rPr>
-              <w:t>Представитель лица, осуществляющего строительство, реконструкцию, капитальный ремонт</w:t>
+              <w:t>Представитель Исполнителя (лица, осуществляющего строительство, реконструкцию, капитальный ремонт)</w:t>
             </w:r>
           </w:p>
         </w:tc>
@@ -8820,7 +8820,7 @@
                 <w:sz w:val="17"/>
                 <w:u w:val="none"/>
               </w:rPr>
-              <w:t>Представитель лица, осуществляющего строительство, реконструкцию, капитальный ремонт, по вопросам строительного контроля</w:t>
+              <w:t>Представитель Исполнителя по вопросам строительного контроля (лица, осуществляющего строительство, реконструкцию, капитальный ремонт)</w:t>
             </w:r>
           </w:p>
         </w:tc>
@@ -9289,7 +9289,7 @@
                 <w:sz w:val="17"/>
                 <w:u w:val="none"/>
               </w:rPr>
-              <w:t>Лицо, осуществляющее строительство, реконструкцию, капитальный ремонт</w:t>
+              <w:t>Исполнитель (лицо, осуществляющее строительство, реконструкцию, капитальный ремонт)</w:t>
             </w:r>
           </w:p>
         </w:tc>
@@ -9321,7 +9321,7 @@
                 <w:sz w:val="18"/>
                 <w:u w:val="single"/>
               </w:rPr>
-              <w:t>{{A5_СТРОИТЕЛЬ}}</w:t>
+              <w:t>{{A5_ИСПОЛНИТЕЛЬ}}</w:t>
             </w:r>
           </w:p>
           <w:p>
@@ -9588,7 +9588,7 @@
                 <w:sz w:val="17"/>
                 <w:u w:val="none"/>
               </w:rPr>
-              <w:t>Представитель лица, осуществляющего строительство, реконструкцию, капитальный ремонт</w:t>
+              <w:t>Представитель Исполнителя (лица, осуществляющего строительство, реконструкцию, капитальный ремонт)</w:t>
             </w:r>
           </w:p>
         </w:tc>
@@ -9620,7 +9620,7 @@
                 <w:sz w:val="18"/>
                 <w:u w:val="single"/>
               </w:rPr>
-              <w:t>{{A5_ПРЕДСТАВИТЕЛЬ_СТРОИТЕЛЯ}}</w:t>
+              <w:t>{{A5_ПРЕДСТАВИТЕЛЬ_ИСПОЛНИТЕЛЯ}}</w:t>
             </w:r>
           </w:p>
           <w:p>
@@ -9671,7 +9671,7 @@
                 <w:sz w:val="17"/>
                 <w:u w:val="none"/>
               </w:rPr>
-              <w:t>Представитель лица, осуществляющего строительство, реконструкцию, капитальный ремонт, по вопросам строительного контроля</w:t>
+              <w:t>Представитель Исполнителя по вопросам строительного контроля (лица, осуществляющего строительство, реконструкцию, капитальный ремонт)</w:t>
             </w:r>
           </w:p>
         </w:tc>
@@ -9703,7 +9703,7 @@
                 <w:sz w:val="18"/>
                 <w:u w:val="single"/>
               </w:rPr>
-              <w:t>{{A5_СТРОЙКОНТРОЛЬ_СТРОИТЕЛЯ}}</w:t>
+              <w:t>{{A5_СТРОЙКОНТРОЛЬ_ИСПОЛНИТЕЛЯ}}</w:t>
             </w:r>
           </w:p>
           <w:p>
@@ -9869,7 +9869,7 @@
                 <w:sz w:val="18"/>
                 <w:u w:val="single"/>
               </w:rPr>
-              <w:t>{{A5_ПРЕДСТАВИТЕЛЬ_ИСПОЛНИТЕЛЯ}}</w:t>
+              <w:t>{{A5_ПРЕДСТАВИТЕЛЬ_ИСПОЛНИТЕЛЯ_РАБОТ}}</w:t>
             </w:r>
           </w:p>
           <w:p>
@@ -10925,7 +10925,7 @@
                 <w:sz w:val="17"/>
                 <w:u w:val="none"/>
               </w:rPr>
-              <w:t>Представитель лица, осуществляющего строительство, реконструкцию, капитальный ремонт</w:t>
+              <w:t>Представитель Исполнителя (лица, осуществляющего строительство, реконструкцию, капитальный ремонт)</w:t>
             </w:r>
           </w:p>
         </w:tc>
@@ -11002,7 +11002,7 @@
                 <w:sz w:val="17"/>
                 <w:u w:val="none"/>
               </w:rPr>
-              <w:t>Представитель лица, осуществляющего строительство, реконструкцию, капитальный ремонт, по вопросам строительного контроля</w:t>
+              <w:t>Представитель Исполнителя по вопросам строительного контроля (лица, осуществляющего строительство, реконструкцию, капитальный ремонт)</w:t>
             </w:r>
           </w:p>
         </w:tc>

</xml_diff>